<commit_message>
thilmann and pspb papers and brandwissen podcast
</commit_message>
<xml_diff>
--- a/files/cv_rrau.docx
+++ b/files/cv_rrau.docx
@@ -89,7 +89,7 @@
           <w:sz w:val="24"/>
           <w:szCs w:val="20"/>
         </w:rPr>
-        <w:t>January 26</w:t>
+        <w:t>March 26</w:t>
       </w:r>
       <w:r>
         <w:rPr>
@@ -2257,15 +2257,7 @@
           <w:sz w:val="24"/>
           <w:szCs w:val="24"/>
         </w:rPr>
-        <w:t>Since 202</w:t>
-      </w:r>
-      <w:r>
-        <w:rPr>
-          <w:rFonts w:ascii="Bell MT" w:hAnsi="Bell MT"/>
-          <w:sz w:val="24"/>
-          <w:szCs w:val="24"/>
-        </w:rPr>
-        <w:t>6</w:t>
+        <w:t>Since 2026</w:t>
       </w:r>
       <w:r>
         <w:rPr>
@@ -2509,15 +2501,7 @@
           <w:sz w:val="24"/>
           <w:szCs w:val="24"/>
         </w:rPr>
-        <w:t>2025</w:t>
-      </w:r>
-      <w:r>
-        <w:rPr>
-          <w:rFonts w:ascii="Bell MT" w:hAnsi="Bell MT"/>
-          <w:sz w:val="24"/>
-          <w:szCs w:val="24"/>
-        </w:rPr>
-        <w:t>-2026</w:t>
+        <w:t>2025-2026</w:t>
       </w:r>
       <w:r>
         <w:rPr>
@@ -4794,6 +4778,8 @@
         <w:ind w:left="397" w:hanging="397"/>
         <w:rPr>
           <w:rFonts w:ascii="Bell MT" w:hAnsi="Bell MT"/>
+          <w:i/>
+          <w:iCs/>
           <w:sz w:val="24"/>
           <w:szCs w:val="24"/>
         </w:rPr>
@@ -4802,62 +4788,29 @@
       <w:r>
         <w:rPr>
           <w:rFonts w:ascii="Bell MT" w:hAnsi="Bell MT"/>
-          <w:b/>
-          <w:bCs/>
-          <w:sz w:val="24"/>
-          <w:szCs w:val="24"/>
-        </w:rPr>
-        <w:t>Rau, R.,</w:t>
-      </w:r>
-      <w:r>
-        <w:rPr>
-          <w:rFonts w:ascii="Bell MT" w:hAnsi="Bell MT"/>
-          <w:sz w:val="24"/>
-          <w:szCs w:val="24"/>
-        </w:rPr>
-        <w:t xml:space="preserve"> Weiner, L., &amp; Vogel, L. (in press). </w:t>
-      </w:r>
-      <w:r>
-        <w:rPr>
-          <w:rFonts w:ascii="Bell MT" w:hAnsi="Bell MT"/>
-          <w:sz w:val="24"/>
-          <w:szCs w:val="24"/>
-        </w:rPr>
-        <w:t>Perceiver Positivity Differences Originate in Early-Stage Impression Formation: Evidence from a Recognition Task</w:t>
-      </w:r>
-      <w:r>
-        <w:rPr>
-          <w:rFonts w:ascii="Bell MT" w:hAnsi="Bell MT"/>
-          <w:sz w:val="24"/>
-          <w:szCs w:val="24"/>
-        </w:rPr>
-        <w:t xml:space="preserve">. </w:t>
-      </w:r>
-      <w:r>
-        <w:rPr>
-          <w:rFonts w:ascii="Bell MT" w:hAnsi="Bell MT"/>
-          <w:i/>
-          <w:iCs/>
-          <w:sz w:val="24"/>
-          <w:szCs w:val="24"/>
-        </w:rPr>
-        <w:t xml:space="preserve">Personality and Social Psychology Bulletin. </w:t>
-      </w:r>
-      <w:r>
-        <w:rPr>
-          <w:rFonts w:ascii="Bell MT" w:hAnsi="Bell MT"/>
-          <w:sz w:val="24"/>
-          <w:szCs w:val="24"/>
-        </w:rPr>
-        <w:t xml:space="preserve">Retrieved from </w:t>
-      </w:r>
-      <w:r>
-        <w:rPr>
-          <w:rFonts w:ascii="Bell MT" w:hAnsi="Bell MT"/>
-          <w:sz w:val="24"/>
-          <w:szCs w:val="24"/>
-        </w:rPr>
-        <w:t>https://osf.io/64389/files/4r7ts</w:t>
+          <w:sz w:val="24"/>
+          <w:szCs w:val="24"/>
+        </w:rPr>
+        <w:t xml:space="preserve">Thielmann, I., Back, M. D., Bleidorn, W., Bukowski, H., Carlson, E. N., Dufner, M., Hofer, G., Hofmann, W., Hopwood, C. J., Human, L. J., Jordan, C. H., Langdon, J., Krueger, J. I., Rau, R., Smillie, L. D., Strohminger, N., Sun, J., Vazire, S., Burghart, M., Casali, N., &amp; Seidl, A. (in </w:t>
+      </w:r>
+      <w:r>
+        <w:rPr>
+          <w:rFonts w:ascii="Bell MT" w:hAnsi="Bell MT"/>
+          <w:sz w:val="24"/>
+          <w:szCs w:val="24"/>
+        </w:rPr>
+        <w:lastRenderedPageBreak/>
+        <w:t xml:space="preserve">press). A consensus statement on self-knowledge conceptualization, measurement, outcomes, and changeability. </w:t>
+      </w:r>
+      <w:r>
+        <w:rPr>
+          <w:rFonts w:ascii="Bell MT" w:hAnsi="Bell MT"/>
+          <w:i/>
+          <w:iCs/>
+          <w:sz w:val="24"/>
+          <w:szCs w:val="24"/>
+        </w:rPr>
+        <w:t>Nature Reviews Psychology.</w:t>
       </w:r>
     </w:p>
     <w:p>
@@ -4866,36 +4819,18 @@
         <w:ind w:left="397" w:hanging="397"/>
         <w:rPr>
           <w:rFonts w:ascii="Bell MT" w:hAnsi="Bell MT"/>
-          <w:i/>
-          <w:iCs/>
-          <w:sz w:val="24"/>
-          <w:szCs w:val="24"/>
-        </w:rPr>
-      </w:pPr>
-      <w:r>
-        <w:rPr>
-          <w:rFonts w:ascii="Bell MT" w:hAnsi="Bell MT"/>
-          <w:sz w:val="24"/>
-          <w:szCs w:val="24"/>
-        </w:rPr>
-        <w:lastRenderedPageBreak/>
-        <w:t>Thielmann, I., Back, M. D., Bleidorn, W., Bukowski, H., Carlson, E. N., Dufner, M., Hofer, G., Hofmann, W., Hopwood, C. J., Human, L. J., Jordan, C. H., Langdon, J., K</w:t>
-      </w:r>
-      <w:r>
-        <w:rPr>
-          <w:rFonts w:ascii="Bell MT" w:hAnsi="Bell MT"/>
-          <w:sz w:val="24"/>
-          <w:szCs w:val="24"/>
-        </w:rPr>
-        <w:t>ru</w:t>
-      </w:r>
-      <w:r>
-        <w:rPr>
-          <w:rFonts w:ascii="Bell MT" w:hAnsi="Bell MT"/>
-          <w:sz w:val="24"/>
-          <w:szCs w:val="24"/>
-        </w:rPr>
-        <w:t xml:space="preserve">eger, J. I., </w:t>
+          <w:sz w:val="24"/>
+          <w:szCs w:val="24"/>
+        </w:rPr>
+      </w:pPr>
+      <w:r>
+        <w:rPr>
+          <w:rFonts w:ascii="Bell MT" w:hAnsi="Bell MT"/>
+          <w:sz w:val="24"/>
+          <w:szCs w:val="24"/>
+          <w:lang w:val="de-DE"/>
+        </w:rPr>
+        <w:t xml:space="preserve">Bleckmann, E., </w:t>
       </w:r>
       <w:r>
         <w:rPr>
@@ -4904,6 +4839,7 @@
           <w:bCs/>
           <w:sz w:val="24"/>
           <w:szCs w:val="24"/>
+          <w:lang w:val="de-DE"/>
         </w:rPr>
         <w:t>Rau, R.,</w:t>
       </w:r>
@@ -4912,40 +4848,17 @@
           <w:rFonts w:ascii="Bell MT" w:hAnsi="Bell MT"/>
           <w:sz w:val="24"/>
           <w:szCs w:val="24"/>
-        </w:rPr>
-        <w:t xml:space="preserve"> Smillie, L. D., Strohminger, N., Sun, J.</w:t>
-      </w:r>
-      <w:r>
-        <w:rPr>
-          <w:rFonts w:ascii="Bell MT" w:hAnsi="Bell MT"/>
-          <w:sz w:val="24"/>
-          <w:szCs w:val="24"/>
-        </w:rPr>
-        <w:t>, Vazire, S., Burghardt, M.,</w:t>
-      </w:r>
-      <w:r>
-        <w:rPr>
-          <w:rFonts w:ascii="Bell MT" w:hAnsi="Bell MT"/>
-          <w:sz w:val="24"/>
-          <w:szCs w:val="24"/>
-        </w:rPr>
-        <w:t xml:space="preserve"> …Seidl, A.</w:t>
-      </w:r>
-      <w:r>
-        <w:rPr>
-          <w:rFonts w:ascii="Bell MT" w:hAnsi="Bell MT"/>
-          <w:sz w:val="24"/>
-          <w:szCs w:val="24"/>
-        </w:rPr>
-        <w:t xml:space="preserve"> (in press). </w:t>
-      </w:r>
-      <w:r>
-        <w:rPr>
-          <w:rFonts w:ascii="Bell MT" w:hAnsi="Bell MT"/>
-          <w:sz w:val="24"/>
-          <w:szCs w:val="24"/>
-        </w:rPr>
-        <w:t>Unveiling Self-Knowledge: A Consensus Approach</w:t>
+          <w:lang w:val="de-DE"/>
+        </w:rPr>
+        <w:t xml:space="preserve"> Lüdtke, O., &amp; Wagner, J. (in press). </w:t>
+      </w:r>
+      <w:r>
+        <w:rPr>
+          <w:rFonts w:ascii="Bell MT" w:hAnsi="Bell MT"/>
+          <w:sz w:val="24"/>
+          <w:szCs w:val="24"/>
+        </w:rPr>
+        <w:t>How Group Personality Composition Affects Person and Group Outcomes: An Integrative Analysis Using the Group-Actor-Partner-Interdependence Model</w:t>
       </w:r>
       <w:r>
         <w:rPr>
@@ -4963,7 +4876,23 @@
           <w:sz w:val="24"/>
           <w:szCs w:val="24"/>
         </w:rPr>
-        <w:t>Nature Reviews Psychology.</w:t>
+        <w:t>Journal of Personality and Social Psychology.</w:t>
+      </w:r>
+      <w:r>
+        <w:rPr>
+          <w:rFonts w:ascii="Bell MT" w:hAnsi="Bell MT"/>
+          <w:sz w:val="24"/>
+          <w:szCs w:val="24"/>
+        </w:rPr>
+        <w:t xml:space="preserve"> Retrieved from </w:t>
+      </w:r>
+      <w:r>
+        <w:rPr>
+          <w:rFonts w:ascii="Bell MT" w:hAnsi="Bell MT"/>
+          <w:sz w:val="24"/>
+          <w:szCs w:val="24"/>
+        </w:rPr>
+        <w:t>https://osf.io/fhcp4</w:t>
       </w:r>
     </w:p>
     <w:p>
@@ -4979,20 +4908,10 @@
       <w:r>
         <w:rPr>
           <w:rFonts w:ascii="Bell MT" w:hAnsi="Bell MT"/>
-          <w:sz w:val="24"/>
-          <w:szCs w:val="24"/>
-          <w:lang w:val="de-DE"/>
-        </w:rPr>
-        <w:t xml:space="preserve">Bleckmann, E., </w:t>
-      </w:r>
-      <w:r>
-        <w:rPr>
-          <w:rFonts w:ascii="Bell MT" w:hAnsi="Bell MT"/>
           <w:b/>
           <w:bCs/>
           <w:sz w:val="24"/>
           <w:szCs w:val="24"/>
-          <w:lang w:val="de-DE"/>
         </w:rPr>
         <w:t>Rau, R.,</w:t>
       </w:r>
@@ -5001,17 +4920,16 @@
           <w:rFonts w:ascii="Bell MT" w:hAnsi="Bell MT"/>
           <w:sz w:val="24"/>
           <w:szCs w:val="24"/>
-          <w:lang w:val="de-DE"/>
-        </w:rPr>
-        <w:t xml:space="preserve"> Lüdtke, O., &amp; Wagner, J. (in press). </w:t>
-      </w:r>
-      <w:r>
-        <w:rPr>
-          <w:rFonts w:ascii="Bell MT" w:hAnsi="Bell MT"/>
-          <w:sz w:val="24"/>
-          <w:szCs w:val="24"/>
-        </w:rPr>
-        <w:t>How Group Personality Composition Affects Person and Group Outcomes: An Integrative Analysis Using the Group-Actor-Partner-Interdependence Model</w:t>
+        </w:rPr>
+        <w:t xml:space="preserve"> Weiner, L., &amp; Vogel, L. (2026). </w:t>
+      </w:r>
+      <w:r>
+        <w:rPr>
+          <w:rFonts w:ascii="Bell MT" w:hAnsi="Bell MT"/>
+          <w:sz w:val="24"/>
+          <w:szCs w:val="24"/>
+        </w:rPr>
+        <w:t>Perceiver Positivity Differences Originate in Early-Stage Impression Formation: Evidence from a Recognition Task</w:t>
       </w:r>
       <w:r>
         <w:rPr>
@@ -5029,23 +4947,15 @@
           <w:sz w:val="24"/>
           <w:szCs w:val="24"/>
         </w:rPr>
-        <w:t>Journal of Personality and Social Psychology.</w:t>
-      </w:r>
-      <w:r>
-        <w:rPr>
-          <w:rFonts w:ascii="Bell MT" w:hAnsi="Bell MT"/>
-          <w:sz w:val="24"/>
-          <w:szCs w:val="24"/>
-        </w:rPr>
-        <w:t xml:space="preserve"> Retrieved from </w:t>
-      </w:r>
-      <w:r>
-        <w:rPr>
-          <w:rFonts w:ascii="Bell MT" w:hAnsi="Bell MT"/>
-          <w:sz w:val="24"/>
-          <w:szCs w:val="24"/>
-        </w:rPr>
-        <w:t>https://osf.io/fhcp4</w:t>
+        <w:t xml:space="preserve">Personality and Social Psychology Bulletin. </w:t>
+      </w:r>
+      <w:r>
+        <w:rPr>
+          <w:rFonts w:ascii="Bell MT" w:hAnsi="Bell MT"/>
+          <w:sz w:val="24"/>
+          <w:szCs w:val="24"/>
+        </w:rPr>
+        <w:t>https://doi.org/10.1177/01461672261424543</w:t>
       </w:r>
     </w:p>
     <w:p>
@@ -5175,7 +5085,6 @@
           <w:b/>
           <w:bCs/>
           <w:color w:val="auto"/>
-          <w:lang w:val="de-DE"/>
         </w:rPr>
         <w:t>Rau, R.*,</w:t>
       </w:r>
@@ -5183,7 +5092,6 @@
         <w:rPr>
           <w:rFonts w:ascii="Bell MT" w:eastAsia="Bell MT" w:hAnsi="Bell MT" w:cs="Bell MT"/>
           <w:color w:val="auto"/>
-          <w:lang w:val="de-DE"/>
         </w:rPr>
         <w:t xml:space="preserve"> Schömann, L. M.*, &amp; Grosz, M. P. (2025). </w:t>
       </w:r>
@@ -5257,7 +5165,6 @@
           <w:b/>
           <w:bCs/>
           <w:color w:val="auto"/>
-          <w:lang w:val="de-DE"/>
         </w:rPr>
         <w:t>Rau, R.,</w:t>
       </w:r>
@@ -5265,7 +5172,6 @@
         <w:rPr>
           <w:rFonts w:ascii="Bell MT" w:eastAsia="Bell MT" w:hAnsi="Bell MT" w:cs="Bell MT"/>
           <w:color w:val="auto"/>
-          <w:lang w:val="de-DE"/>
         </w:rPr>
         <w:t xml:space="preserve"> Grosz, M., &amp; Back, M. D. (2025). </w:t>
       </w:r>
@@ -6046,7 +5952,16 @@
           <w:sz w:val="24"/>
           <w:szCs w:val="24"/>
         </w:rPr>
-        <w:t xml:space="preserve">Do agency and communion explain the relationship between perceiver and target effects in interpersonal perception? A meta-analysis on generalized reciprocity. </w:t>
+        <w:t xml:space="preserve">Do agency and communion explain the relationship between perceiver and target effects in interpersonal perception? A meta-analysis </w:t>
+      </w:r>
+      <w:r>
+        <w:rPr>
+          <w:rFonts w:ascii="Bell MT" w:hAnsi="Bell MT"/>
+          <w:sz w:val="24"/>
+          <w:szCs w:val="24"/>
+        </w:rPr>
+        <w:lastRenderedPageBreak/>
+        <w:t xml:space="preserve">on generalized reciprocity. </w:t>
       </w:r>
       <w:r>
         <w:rPr>
@@ -6130,7 +6045,6 @@
           <w:szCs w:val="23"/>
           <w:lang w:val="de-DE"/>
         </w:rPr>
-        <w:lastRenderedPageBreak/>
         <w:t xml:space="preserve">Thielmann, I.*, </w:t>
       </w:r>
       <w:r>
@@ -6263,7 +6177,6 @@
           <w:bCs/>
           <w:sz w:val="24"/>
           <w:szCs w:val="24"/>
-          <w:lang w:val="de-DE"/>
         </w:rPr>
         <w:t>Rau, R.,</w:t>
       </w:r>
@@ -6272,7 +6185,6 @@
           <w:rFonts w:ascii="Bell MT" w:hAnsi="Bell MT"/>
           <w:sz w:val="24"/>
           <w:szCs w:val="24"/>
-          <w:lang w:val="de-DE"/>
         </w:rPr>
         <w:t xml:space="preserve"> Zimmermann, J., &amp; Back, M. D. (2023). </w:t>
       </w:r>
@@ -6360,25 +6272,7 @@
           <w:sz w:val="24"/>
           <w:szCs w:val="24"/>
         </w:rPr>
-        <w:t xml:space="preserve"> Carlson, E. N., Dufner, M., </w:t>
-      </w:r>
-      <w:proofErr w:type="spellStart"/>
-      <w:r>
-        <w:rPr>
-          <w:rFonts w:ascii="Bell MT" w:hAnsi="Bell MT" w:cs="Segoe UI"/>
-          <w:sz w:val="24"/>
-          <w:szCs w:val="24"/>
-        </w:rPr>
-        <w:t>Geukes</w:t>
-      </w:r>
-      <w:proofErr w:type="spellEnd"/>
-      <w:r>
-        <w:rPr>
-          <w:rFonts w:ascii="Bell MT" w:hAnsi="Bell MT" w:cs="Segoe UI"/>
-          <w:sz w:val="24"/>
-          <w:szCs w:val="24"/>
-        </w:rPr>
-        <w:t xml:space="preserve">, K., Kraft, L., Krause, S., </w:t>
+        <w:t xml:space="preserve"> Carlson, E. N., Dufner, M., Geukes, K., Kraft, L., Krause, S., </w:t>
       </w:r>
       <w:proofErr w:type="spellStart"/>
       <w:r>
@@ -6883,23 +6777,7 @@
           <w:rFonts w:ascii="Bell MT" w:hAnsi="Bell MT" w:cs="Segoe UI"/>
           <w:lang w:val="de-DE"/>
         </w:rPr>
-        <w:t xml:space="preserve"> Thielmann, I., Breil, S. M., </w:t>
-      </w:r>
-      <w:proofErr w:type="spellStart"/>
-      <w:r>
-        <w:rPr>
-          <w:rFonts w:ascii="Bell MT" w:hAnsi="Bell MT" w:cs="Segoe UI"/>
-          <w:lang w:val="de-DE"/>
-        </w:rPr>
-        <w:t>Geukes</w:t>
-      </w:r>
-      <w:proofErr w:type="spellEnd"/>
-      <w:r>
-        <w:rPr>
-          <w:rFonts w:ascii="Bell MT" w:hAnsi="Bell MT" w:cs="Segoe UI"/>
-          <w:lang w:val="de-DE"/>
-        </w:rPr>
-        <w:t xml:space="preserve">, K., Krause, S., </w:t>
+        <w:t xml:space="preserve"> Thielmann, I., Breil, S. M., Geukes, K., Krause, S., </w:t>
       </w:r>
       <w:proofErr w:type="spellStart"/>
       <w:r>
@@ -7097,23 +6975,7 @@
           <w:rFonts w:ascii="Bell MT" w:hAnsi="Bell MT" w:cstheme="minorBidi"/>
           <w:color w:val="auto"/>
         </w:rPr>
-        <w:t xml:space="preserve">., Nestler, S, </w:t>
-      </w:r>
-      <w:proofErr w:type="spellStart"/>
-      <w:r>
-        <w:rPr>
-          <w:rFonts w:ascii="Bell MT" w:hAnsi="Bell MT" w:cstheme="minorBidi"/>
-          <w:color w:val="auto"/>
-        </w:rPr>
-        <w:t>Geukes</w:t>
-      </w:r>
-      <w:proofErr w:type="spellEnd"/>
-      <w:r>
-        <w:rPr>
-          <w:rFonts w:ascii="Bell MT" w:hAnsi="Bell MT" w:cstheme="minorBidi"/>
-          <w:color w:val="auto"/>
-        </w:rPr>
-        <w:t xml:space="preserve">, K., Back, M. D., &amp; Dufner, M. (2019). Can other-derogation be beneficial? Seeing others as low in agency can lead to an agentic reputation in newly formed face-to-face groups. </w:t>
+        <w:t xml:space="preserve">., Nestler, S, Geukes, K., Back, M. D., &amp; Dufner, M. (2019). Can other-derogation be beneficial? Seeing others as low in agency can lead to an agentic reputation in newly formed face-to-face groups. </w:t>
       </w:r>
       <w:r>
         <w:rPr>
@@ -7173,7 +7035,6 @@
           <w:sz w:val="24"/>
           <w:szCs w:val="24"/>
         </w:rPr>
-        <w:lastRenderedPageBreak/>
         <w:t>Conference Talks</w:t>
       </w:r>
       <w:r>
@@ -7580,27 +7441,7 @@
           <w:szCs w:val="24"/>
           <w:lang w:val="de-DE"/>
         </w:rPr>
-        <w:t xml:space="preserve">Rau, R., Carlson, E. N., Dufner, M., </w:t>
-      </w:r>
-      <w:proofErr w:type="spellStart"/>
-      <w:r>
-        <w:rPr>
-          <w:rFonts w:ascii="Bell MT" w:hAnsi="Bell MT"/>
-          <w:sz w:val="24"/>
-          <w:szCs w:val="24"/>
-          <w:lang w:val="de-DE"/>
-        </w:rPr>
-        <w:t>Geukes</w:t>
-      </w:r>
-      <w:proofErr w:type="spellEnd"/>
-      <w:r>
-        <w:rPr>
-          <w:rFonts w:ascii="Bell MT" w:hAnsi="Bell MT"/>
-          <w:sz w:val="24"/>
-          <w:szCs w:val="24"/>
-          <w:lang w:val="de-DE"/>
-        </w:rPr>
-        <w:t xml:space="preserve">, K., Kraft, L., Krause, S., . . . </w:t>
+        <w:t xml:space="preserve">Rau, R., Carlson, E. N., Dufner, M., Geukes, K., Kraft, L., Krause, S., . . . </w:t>
       </w:r>
       <w:r>
         <w:rPr>
@@ -7723,27 +7564,7 @@
           <w:szCs w:val="24"/>
           <w:lang w:val="de-DE"/>
         </w:rPr>
-        <w:t xml:space="preserve">Rau, R., Carlson, E. N., Dufner, M., </w:t>
-      </w:r>
-      <w:proofErr w:type="spellStart"/>
-      <w:r>
-        <w:rPr>
-          <w:rFonts w:ascii="Bell MT" w:hAnsi="Bell MT"/>
-          <w:sz w:val="24"/>
-          <w:szCs w:val="24"/>
-          <w:lang w:val="de-DE"/>
-        </w:rPr>
-        <w:t>Geukes</w:t>
-      </w:r>
-      <w:proofErr w:type="spellEnd"/>
-      <w:r>
-        <w:rPr>
-          <w:rFonts w:ascii="Bell MT" w:hAnsi="Bell MT"/>
-          <w:sz w:val="24"/>
-          <w:szCs w:val="24"/>
-          <w:lang w:val="de-DE"/>
-        </w:rPr>
-        <w:t xml:space="preserve">, K., Kraft, L., Krause, S., . . . </w:t>
+        <w:t xml:space="preserve">Rau, R., Carlson, E. N., Dufner, M., Geukes, K., Kraft, L., Krause, S., . . . </w:t>
       </w:r>
       <w:r>
         <w:rPr>
@@ -7992,27 +7813,7 @@
           <w:szCs w:val="24"/>
           <w:lang w:val="de-DE"/>
         </w:rPr>
-        <w:t xml:space="preserve">Rau, R., Nestler, S, </w:t>
-      </w:r>
-      <w:proofErr w:type="spellStart"/>
-      <w:r>
-        <w:rPr>
-          <w:rFonts w:ascii="Bell MT" w:hAnsi="Bell MT"/>
-          <w:sz w:val="24"/>
-          <w:szCs w:val="24"/>
-          <w:lang w:val="de-DE"/>
-        </w:rPr>
-        <w:t>Geukes</w:t>
-      </w:r>
-      <w:proofErr w:type="spellEnd"/>
-      <w:r>
-        <w:rPr>
-          <w:rFonts w:ascii="Bell MT" w:hAnsi="Bell MT"/>
-          <w:sz w:val="24"/>
-          <w:szCs w:val="24"/>
-          <w:lang w:val="de-DE"/>
-        </w:rPr>
-        <w:t xml:space="preserve">, K., Back, M. D., &amp; Dufner, M. (2019). </w:t>
+        <w:t xml:space="preserve">Rau, R., Nestler, S, Geukes, K., Back, M. D., &amp; Dufner, M. (2019). </w:t>
       </w:r>
       <w:r>
         <w:rPr>
@@ -8619,7 +8420,19 @@
           <w:szCs w:val="24"/>
           <w:lang w:val="de-DE"/>
         </w:rPr>
-        <w:t>Was bedeuten individuelle Beurteilungstendenzen beim Kennenlernen: Generealisierte Stereotype oder situationsspezifische Erwartungen über „die Anderen“?</w:t>
+        <w:t xml:space="preserve">Was bedeuten individuelle Beurteilungstendenzen beim Kennenlernen: Generealisierte Stereotype oder </w:t>
+      </w:r>
+      <w:r>
+        <w:rPr>
+          <w:rFonts w:ascii="Bell MT" w:hAnsi="Bell MT"/>
+          <w:i/>
+          <w:iCs/>
+          <w:sz w:val="24"/>
+          <w:szCs w:val="24"/>
+          <w:lang w:val="de-DE"/>
+        </w:rPr>
+        <w:lastRenderedPageBreak/>
+        <w:t>situationsspezifische Erwartungen über „die Anderen“?</w:t>
       </w:r>
       <w:r>
         <w:rPr>
@@ -8659,28 +8472,7 @@
           <w:szCs w:val="24"/>
           <w:lang w:val="de-DE"/>
         </w:rPr>
-        <w:lastRenderedPageBreak/>
-        <w:t xml:space="preserve">Rau R., Dufner, M., </w:t>
-      </w:r>
-      <w:proofErr w:type="spellStart"/>
-      <w:r>
-        <w:rPr>
-          <w:rFonts w:ascii="Bell MT" w:hAnsi="Bell MT"/>
-          <w:sz w:val="24"/>
-          <w:szCs w:val="24"/>
-          <w:lang w:val="de-DE"/>
-        </w:rPr>
-        <w:t>Geukes</w:t>
-      </w:r>
-      <w:proofErr w:type="spellEnd"/>
-      <w:r>
-        <w:rPr>
-          <w:rFonts w:ascii="Bell MT" w:hAnsi="Bell MT"/>
-          <w:sz w:val="24"/>
-          <w:szCs w:val="24"/>
-          <w:lang w:val="de-DE"/>
-        </w:rPr>
-        <w:t xml:space="preserve">, K., Back, M. D., &amp; Nestler, S. (2018). </w:t>
+        <w:t xml:space="preserve">Rau R., Dufner, M., Geukes, K., Back, M. D., &amp; Nestler, S. (2018). </w:t>
       </w:r>
       <w:r>
         <w:rPr>
@@ -9010,27 +8802,7 @@
           <w:szCs w:val="24"/>
           <w:lang w:val="de-DE"/>
         </w:rPr>
-        <w:t xml:space="preserve"> R., Dufner, M., </w:t>
-      </w:r>
-      <w:proofErr w:type="spellStart"/>
-      <w:r>
-        <w:rPr>
-          <w:rFonts w:ascii="Bell MT" w:hAnsi="Bell MT"/>
-          <w:sz w:val="24"/>
-          <w:szCs w:val="24"/>
-          <w:lang w:val="de-DE"/>
-        </w:rPr>
-        <w:t>Geukes</w:t>
-      </w:r>
-      <w:proofErr w:type="spellEnd"/>
-      <w:r>
-        <w:rPr>
-          <w:rFonts w:ascii="Bell MT" w:hAnsi="Bell MT"/>
-          <w:sz w:val="24"/>
-          <w:szCs w:val="24"/>
-          <w:lang w:val="de-DE"/>
-        </w:rPr>
-        <w:t xml:space="preserve">, K., Back, M. D., &amp; Nestler, S. (2017). </w:t>
+        <w:t xml:space="preserve"> R., Dufner, M., Geukes, K., Back, M. D., &amp; Nestler, S. (2017). </w:t>
       </w:r>
       <w:r>
         <w:rPr>

</xml_diff>

<commit_message>
early stage paper pdf
</commit_message>
<xml_diff>
--- a/files/cv_rrau.docx
+++ b/files/cv_rrau.docx
@@ -4791,7 +4791,25 @@
           <w:sz w:val="24"/>
           <w:szCs w:val="24"/>
         </w:rPr>
-        <w:t xml:space="preserve">Thielmann, I., Back, M. D., Bleidorn, W., Bukowski, H., Carlson, E. N., Dufner, M., Hofer, G., Hofmann, W., Hopwood, C. J., Human, L. J., Jordan, C. H., Langdon, J., Krueger, J. I., Rau, R., Smillie, L. D., Strohminger, N., Sun, J., Vazire, S., Burghart, M., Casali, N., &amp; Seidl, A. (in </w:t>
+        <w:t xml:space="preserve">Thielmann, I., Back, M. D., Bleidorn, W., Bukowski, H., Carlson, E. N., Dufner, M., Hofer, G., Hofmann, W., Hopwood, C. J., Human, L. J., Jordan, C. H., Langdon, J., Krueger, J. I., </w:t>
+      </w:r>
+      <w:r>
+        <w:rPr>
+          <w:rFonts w:ascii="Bell MT" w:hAnsi="Bell MT"/>
+          <w:b/>
+          <w:bCs/>
+          <w:sz w:val="24"/>
+          <w:szCs w:val="24"/>
+        </w:rPr>
+        <w:t>Rau, R.</w:t>
+      </w:r>
+      <w:r>
+        <w:rPr>
+          <w:rFonts w:ascii="Bell MT" w:hAnsi="Bell MT"/>
+          <w:sz w:val="24"/>
+          <w:szCs w:val="24"/>
+        </w:rPr>
+        <w:t xml:space="preserve">, Smillie, L. D., Strohminger, N., Sun, J., Vazire, S., Burghart, M., Casali, N., &amp; Seidl, A. (in </w:t>
       </w:r>
       <w:r>
         <w:rPr>
@@ -4828,7 +4846,6 @@
           <w:rFonts w:ascii="Bell MT" w:hAnsi="Bell MT"/>
           <w:sz w:val="24"/>
           <w:szCs w:val="24"/>
-          <w:lang w:val="de-DE"/>
         </w:rPr>
         <w:t xml:space="preserve">Bleckmann, E., </w:t>
       </w:r>
@@ -4839,7 +4856,6 @@
           <w:bCs/>
           <w:sz w:val="24"/>
           <w:szCs w:val="24"/>
-          <w:lang w:val="de-DE"/>
         </w:rPr>
         <w:t>Rau, R.,</w:t>
       </w:r>
@@ -4848,9 +4864,26 @@
           <w:rFonts w:ascii="Bell MT" w:hAnsi="Bell MT"/>
           <w:sz w:val="24"/>
           <w:szCs w:val="24"/>
-          <w:lang w:val="de-DE"/>
-        </w:rPr>
-        <w:t xml:space="preserve"> Lüdtke, O., &amp; Wagner, J. (in press). </w:t>
+        </w:rPr>
+        <w:t xml:space="preserve"> </w:t>
+      </w:r>
+      <w:proofErr w:type="spellStart"/>
+      <w:r>
+        <w:rPr>
+          <w:rFonts w:ascii="Bell MT" w:hAnsi="Bell MT"/>
+          <w:sz w:val="24"/>
+          <w:szCs w:val="24"/>
+        </w:rPr>
+        <w:t>Lüdtke</w:t>
+      </w:r>
+      <w:proofErr w:type="spellEnd"/>
+      <w:r>
+        <w:rPr>
+          <w:rFonts w:ascii="Bell MT" w:hAnsi="Bell MT"/>
+          <w:sz w:val="24"/>
+          <w:szCs w:val="24"/>
+        </w:rPr>
+        <w:t xml:space="preserve">, O., &amp; Wagner, J. (in press). </w:t>
       </w:r>
       <w:r>
         <w:rPr>
@@ -4912,6 +4945,7 @@
           <w:bCs/>
           <w:sz w:val="24"/>
           <w:szCs w:val="24"/>
+          <w:lang w:val="de-DE"/>
         </w:rPr>
         <w:t>Rau, R.,</w:t>
       </w:r>
@@ -4920,6 +4954,7 @@
           <w:rFonts w:ascii="Bell MT" w:hAnsi="Bell MT"/>
           <w:sz w:val="24"/>
           <w:szCs w:val="24"/>
+          <w:lang w:val="de-DE"/>
         </w:rPr>
         <w:t xml:space="preserve"> Weiner, L., &amp; Vogel, L. (2026). </w:t>
       </w:r>
@@ -4973,7 +5008,6 @@
           <w:rFonts w:ascii="Bell MT" w:hAnsi="Bell MT"/>
           <w:sz w:val="24"/>
           <w:szCs w:val="24"/>
-          <w:lang w:val="de-DE"/>
         </w:rPr>
         <w:t xml:space="preserve">Dufner, M., Grapsas, S., &amp; </w:t>
       </w:r>
@@ -4984,7 +5018,6 @@
           <w:bCs/>
           <w:sz w:val="24"/>
           <w:szCs w:val="24"/>
-          <w:lang w:val="de-DE"/>
         </w:rPr>
         <w:t>Rau, R.</w:t>
       </w:r>
@@ -4993,7 +5026,6 @@
           <w:rFonts w:ascii="Bell MT" w:hAnsi="Bell MT"/>
           <w:sz w:val="24"/>
           <w:szCs w:val="24"/>
-          <w:lang w:val="de-DE"/>
         </w:rPr>
         <w:t xml:space="preserve"> (</w:t>
       </w:r>
@@ -5002,7 +5034,6 @@
           <w:rFonts w:ascii="Bell MT" w:hAnsi="Bell MT"/>
           <w:sz w:val="24"/>
           <w:szCs w:val="24"/>
-          <w:lang w:val="de-DE"/>
         </w:rPr>
         <w:t>2025</w:t>
       </w:r>
@@ -5011,7 +5042,6 @@
           <w:rFonts w:ascii="Bell MT" w:hAnsi="Bell MT"/>
           <w:sz w:val="24"/>
           <w:szCs w:val="24"/>
-          <w:lang w:val="de-DE"/>
         </w:rPr>
         <w:t xml:space="preserve">). </w:t>
       </w:r>

</xml_diff>

<commit_message>
of instead of for
</commit_message>
<xml_diff>
--- a/files/cv_rrau.docx
+++ b/files/cv_rrau.docx
@@ -750,7 +750,71 @@
           <w:sz w:val="24"/>
           <w:szCs w:val="24"/>
         </w:rPr>
-        <w:t xml:space="preserve"> (W2 equivalent) for Social and Personality Psychology, HMU </w:t>
+        <w:t xml:space="preserve"> (W2 equivalent) </w:t>
+      </w:r>
+      <w:r>
+        <w:rPr>
+          <w:rFonts w:ascii="Bell MT" w:hAnsi="Bell MT"/>
+          <w:sz w:val="24"/>
+          <w:szCs w:val="24"/>
+        </w:rPr>
+        <w:t>of</w:t>
+      </w:r>
+      <w:r>
+        <w:rPr>
+          <w:rFonts w:ascii="Bell MT" w:hAnsi="Bell MT"/>
+          <w:sz w:val="24"/>
+          <w:szCs w:val="24"/>
+        </w:rPr>
+        <w:t xml:space="preserve"> </w:t>
+      </w:r>
+      <w:r>
+        <w:rPr>
+          <w:rFonts w:ascii="Bell MT" w:hAnsi="Bell MT"/>
+          <w:sz w:val="24"/>
+          <w:szCs w:val="24"/>
+        </w:rPr>
+        <w:t>S</w:t>
+      </w:r>
+      <w:r>
+        <w:rPr>
+          <w:rFonts w:ascii="Bell MT" w:hAnsi="Bell MT"/>
+          <w:sz w:val="24"/>
+          <w:szCs w:val="24"/>
+        </w:rPr>
+        <w:t xml:space="preserve">ocial and </w:t>
+      </w:r>
+      <w:r>
+        <w:rPr>
+          <w:rFonts w:ascii="Bell MT" w:hAnsi="Bell MT"/>
+          <w:sz w:val="24"/>
+          <w:szCs w:val="24"/>
+        </w:rPr>
+        <w:t>P</w:t>
+      </w:r>
+      <w:r>
+        <w:rPr>
+          <w:rFonts w:ascii="Bell MT" w:hAnsi="Bell MT"/>
+          <w:sz w:val="24"/>
+          <w:szCs w:val="24"/>
+        </w:rPr>
+        <w:t xml:space="preserve">ersonality </w:t>
+      </w:r>
+      <w:r>
+        <w:rPr>
+          <w:rFonts w:ascii="Bell MT" w:hAnsi="Bell MT"/>
+          <w:sz w:val="24"/>
+          <w:szCs w:val="24"/>
+        </w:rPr>
+        <w:t>P</w:t>
+      </w:r>
+      <w:r>
+        <w:rPr>
+          <w:rFonts w:ascii="Bell MT" w:hAnsi="Bell MT"/>
+          <w:sz w:val="24"/>
+          <w:szCs w:val="24"/>
+        </w:rPr>
+        <w:t xml:space="preserve">sychology, HMU </w:t>
       </w:r>
       <w:r>
         <w:rPr>
@@ -4849,46 +4913,28 @@
       <w:r>
         <w:rPr>
           <w:rFonts w:ascii="Bell MT" w:hAnsi="Bell MT"/>
-          <w:i/>
-          <w:iCs/>
-          <w:sz w:val="24"/>
-          <w:szCs w:val="24"/>
-        </w:rPr>
-        <w:t>Intuitive judgments of strangers are more popular but not more accurate than deliberate ones</w:t>
-      </w:r>
-      <w:r>
-        <w:rPr>
-          <w:rFonts w:ascii="Bell MT" w:hAnsi="Bell MT"/>
-          <w:i/>
-          <w:iCs/>
-          <w:sz w:val="24"/>
-          <w:szCs w:val="24"/>
-        </w:rPr>
-        <w:t>.</w:t>
-      </w:r>
-      <w:r>
-        <w:rPr>
-          <w:rFonts w:ascii="Bell MT" w:hAnsi="Bell MT"/>
-          <w:sz w:val="24"/>
-          <w:szCs w:val="24"/>
-        </w:rPr>
-        <w:t xml:space="preserve"> </w:t>
-      </w:r>
-      <w:r>
-        <w:rPr>
-          <w:rFonts w:ascii="Bell MT" w:hAnsi="Bell MT"/>
-          <w:sz w:val="24"/>
-          <w:szCs w:val="24"/>
-        </w:rPr>
-        <w:t>Social Psychological and Personality Science</w:t>
-      </w:r>
-      <w:r>
-        <w:rPr>
-          <w:rFonts w:ascii="Bell MT" w:hAnsi="Bell MT"/>
-          <w:sz w:val="24"/>
-          <w:szCs w:val="24"/>
-        </w:rPr>
-        <w:t xml:space="preserve">. Retrieved from </w:t>
+          <w:sz w:val="24"/>
+          <w:szCs w:val="24"/>
+        </w:rPr>
+        <w:t xml:space="preserve">Intuitive judgments of strangers are more popular but not more accurate than deliberate ones. </w:t>
+      </w:r>
+      <w:r>
+        <w:rPr>
+          <w:rFonts w:ascii="Bell MT" w:hAnsi="Bell MT"/>
+          <w:i/>
+          <w:iCs/>
+          <w:sz w:val="24"/>
+          <w:szCs w:val="24"/>
+        </w:rPr>
+        <w:t>Social Psychological and Personality Science.</w:t>
+      </w:r>
+      <w:r>
+        <w:rPr>
+          <w:rFonts w:ascii="Bell MT" w:hAnsi="Bell MT"/>
+          <w:sz w:val="24"/>
+          <w:szCs w:val="24"/>
+        </w:rPr>
+        <w:t xml:space="preserve"> Retrieved from </w:t>
       </w:r>
       <w:r>
         <w:rPr>
@@ -4996,21 +5042,7 @@
         <w:rPr>
           <w:rFonts w:ascii="Bell MT" w:hAnsi="Bell MT"/>
         </w:rPr>
-        <w:t>*</w:t>
-      </w:r>
-      <w:proofErr w:type="gramStart"/>
-      <w:r>
-        <w:rPr>
-          <w:rFonts w:ascii="Bell MT" w:hAnsi="Bell MT"/>
-        </w:rPr>
-        <w:t>shared</w:t>
-      </w:r>
-      <w:proofErr w:type="gramEnd"/>
-      <w:r>
-        <w:rPr>
-          <w:rFonts w:ascii="Bell MT" w:hAnsi="Bell MT"/>
-        </w:rPr>
-        <w:t xml:space="preserve"> first authorship</w:t>
+        <w:t>*shared first authorship</w:t>
       </w:r>
     </w:p>
     <w:p>
@@ -5738,21 +5770,7 @@
         <w:rPr>
           <w:rFonts w:ascii="Bell MT" w:hAnsi="Bell MT"/>
         </w:rPr>
-        <w:t>*</w:t>
-      </w:r>
-      <w:proofErr w:type="gramStart"/>
-      <w:r>
-        <w:rPr>
-          <w:rFonts w:ascii="Bell MT" w:hAnsi="Bell MT"/>
-        </w:rPr>
-        <w:t>shared</w:t>
-      </w:r>
-      <w:proofErr w:type="gramEnd"/>
-      <w:r>
-        <w:rPr>
-          <w:rFonts w:ascii="Bell MT" w:hAnsi="Bell MT"/>
-        </w:rPr>
-        <w:t xml:space="preserve"> first authorship</w:t>
+        <w:t>*shared first authorship</w:t>
       </w:r>
     </w:p>
     <w:p>
@@ -6741,21 +6759,7 @@
         <w:rPr>
           <w:rFonts w:ascii="Bell MT" w:hAnsi="Bell MT"/>
         </w:rPr>
-        <w:t xml:space="preserve">* </w:t>
-      </w:r>
-      <w:proofErr w:type="gramStart"/>
-      <w:r>
-        <w:rPr>
-          <w:rFonts w:ascii="Bell MT" w:hAnsi="Bell MT"/>
-        </w:rPr>
-        <w:t>shared</w:t>
-      </w:r>
-      <w:proofErr w:type="gramEnd"/>
-      <w:r>
-        <w:rPr>
-          <w:rFonts w:ascii="Bell MT" w:hAnsi="Bell MT"/>
-        </w:rPr>
-        <w:t xml:space="preserve"> first authorship</w:t>
+        <w:t>* shared first authorship</w:t>
       </w:r>
     </w:p>
     <w:p>
@@ -7533,21 +7537,7 @@
         <w:rPr>
           <w:rFonts w:ascii="Bell MT" w:hAnsi="Bell MT"/>
         </w:rPr>
-        <w:t xml:space="preserve"> </w:t>
-      </w:r>
-      <w:proofErr w:type="gramStart"/>
-      <w:r>
-        <w:rPr>
-          <w:rFonts w:ascii="Bell MT" w:hAnsi="Bell MT"/>
-        </w:rPr>
-        <w:t>shared</w:t>
-      </w:r>
-      <w:proofErr w:type="gramEnd"/>
-      <w:r>
-        <w:rPr>
-          <w:rFonts w:ascii="Bell MT" w:hAnsi="Bell MT"/>
-        </w:rPr>
-        <w:t xml:space="preserve"> first authorship</w:t>
+        <w:t xml:space="preserve"> shared first authorship</w:t>
       </w:r>
     </w:p>
     <w:p>

</xml_diff>